<commit_message>
Adding realtime chat to resume
</commit_message>
<xml_diff>
--- a/index_files/tomas-maly-resume.docx
+++ b/index_files/tomas-maly-resume.docx
@@ -213,7 +213,7 @@
           <w:rFonts w:ascii="Arial" w:hAnsi="Arial" w:eastAsia="Arial" w:cs="Arial"/>
           <w:b w:val="0"/>
         </w:rPr>
-        <w:t xml:space="preserve"> Realtime/WebSockets, Stripe, RevenueCat, push notifications, deep linking, maps, barcodes, AI-based image analysis, internationalization (i18n), localization (l10n)</w:t>
+        <w:t xml:space="preserve"> Real-time chat, WebSockets, Stripe, RevenueCat, push notifications, deep linking, maps, barcodes, AI-based image analysis, internationalization (i18n), localization (l10n)</w:t>
       </w:r>
     </w:p>
     <w:p>
@@ -394,7 +394,7 @@
           <w:rFonts w:ascii="Arial" w:hAnsi="Arial" w:eastAsia="Arial" w:cs="Arial"/>
           <w:b w:val="0"/>
         </w:rPr>
-        <w:t xml:space="preserve"> Architected a multi-tenant field-service SaaS with reusable workflows across multiple trades.</w:t>
+        <w:t xml:space="preserve"> Architected a multi-tenant field-service SaaS with real-time customer-provider chat and reusable workflows across multiple trades.</w:t>
       </w:r>
     </w:p>
     <w:p>
@@ -716,7 +716,7 @@
           <w:rFonts w:ascii="Arial" w:hAnsi="Arial" w:eastAsia="Arial" w:cs="Arial"/>
           <w:b w:val="0"/>
         </w:rPr>
-        <w:t xml:space="preserve"> Implemented realtime updates with technician location, job status, work authorization, and updates.</w:t>
+        <w:t xml:space="preserve"> Implemented real-time customer-technician chat, location updates, job status, and work authorization.</w:t>
       </w:r>
     </w:p>
     <w:p>
@@ -1084,7 +1084,7 @@
           <w:rFonts w:ascii="Arial" w:hAnsi="Arial" w:eastAsia="Arial" w:cs="Arial"/>
           <w:b w:val="0"/>
         </w:rPr>
-        <w:t xml:space="preserve"> Implemented wearable-data integration and coach-client chat across Swift/SwiftUI/UIKit.</w:t>
+        <w:t xml:space="preserve"> Implemented wearable-data integration and real-time coach-client chat across Swift/SwiftUI/UIKit.</w:t>
       </w:r>
     </w:p>
     <w:p>

</xml_diff>